<commit_message>
Update laporan Week 2
</commit_message>
<xml_diff>
--- a/week2/docs/P02_PM_Gempita Fitri Nurdini.docx
+++ b/week2/docs/P02_PM_Gempita Fitri Nurdini.docx
@@ -10814,6 +10814,30 @@
         </w:tc>
       </w:tr>
     </w:tbl>
+    <w:p/>
+    <w:p>
+      <w:r>
+        <w:t xml:space="preserve">Link </w:t>
+      </w:r>
+      <w:proofErr w:type="spellStart"/>
+      <w:r>
+        <w:t>GitHub</w:t>
+      </w:r>
+      <w:proofErr w:type="spellEnd"/>
+      <w:r>
+        <w:t>:</w:t>
+      </w:r>
+    </w:p>
+    <w:p>
+      <w:hyperlink r:id="rId11" w:history="1">
+        <w:r>
+          <w:rPr>
+            <w:rStyle w:val="Hyperlink"/>
+          </w:rPr>
+          <w:t>https://github.com/gempitadini/Pemrograman-Mobile.git</w:t>
+        </w:r>
+      </w:hyperlink>
+    </w:p>
     <w:p>
       <w:bookmarkStart w:id="0" w:name="_GoBack"/>
       <w:bookmarkEnd w:id="0"/>
@@ -11676,6 +11700,17 @@
       <w:szCs w:val="32"/>
     </w:rPr>
   </w:style>
+  <w:style w:type="character" w:styleId="Hyperlink">
+    <w:name w:val="Hyperlink"/>
+    <w:basedOn w:val="DefaultParagraphFont"/>
+    <w:uiPriority w:val="99"/>
+    <w:unhideWhenUsed/>
+    <w:rsid w:val="00A166FF"/>
+    <w:rPr>
+      <w:color w:val="0563C1" w:themeColor="hyperlink"/>
+      <w:u w:val="single"/>
+    </w:rPr>
+  </w:style>
 </w:styles>
 </file>
 

</xml_diff>